<commit_message>
Guide: continue step numbering across the install code block
Co-Authored-By: Claude Opus 5.5 <noreply@anthropic.com>
</commit_message>
<xml_diff>
--- a/docs/Stock_System_Guide_en.docx
+++ b/docs/Stock_System_Guide_en.docx
@@ -1153,7 +1153,7 @@
         <w:pStyle w:val="ListParagraph"/>
         <w:numPr>
           <w:ilvl w:val="0"/>
-          <w:numId w:val="4"/>
+          <w:numId w:val="3"/>
         </w:numPr>
         <w:spacing w:after="60"/>
       </w:pPr>
@@ -1190,7 +1190,7 @@
         <w:pStyle w:val="ListParagraph"/>
         <w:numPr>
           <w:ilvl w:val="0"/>
-          <w:numId w:val="4"/>
+          <w:numId w:val="3"/>
         </w:numPr>
         <w:spacing w:after="60"/>
       </w:pPr>
@@ -1203,7 +1203,7 @@
         <w:pStyle w:val="ListParagraph"/>
         <w:numPr>
           <w:ilvl w:val="0"/>
-          <w:numId w:val="4"/>
+          <w:numId w:val="3"/>
         </w:numPr>
         <w:spacing w:after="60"/>
       </w:pPr>
@@ -2106,7 +2106,7 @@
         <w:pStyle w:val="ListParagraph"/>
         <w:numPr>
           <w:ilvl w:val="0"/>
-          <w:numId w:val="5"/>
+          <w:numId w:val="4"/>
         </w:numPr>
         <w:spacing w:after="60"/>
       </w:pPr>
@@ -2119,7 +2119,7 @@
         <w:pStyle w:val="ListParagraph"/>
         <w:numPr>
           <w:ilvl w:val="0"/>
-          <w:numId w:val="5"/>
+          <w:numId w:val="4"/>
         </w:numPr>
         <w:spacing w:after="60"/>
       </w:pPr>
@@ -2142,7 +2142,7 @@
         <w:pStyle w:val="ListParagraph"/>
         <w:numPr>
           <w:ilvl w:val="0"/>
-          <w:numId w:val="5"/>
+          <w:numId w:val="4"/>
         </w:numPr>
         <w:spacing w:after="60"/>
       </w:pPr>
@@ -2155,7 +2155,7 @@
         <w:pStyle w:val="ListParagraph"/>
         <w:numPr>
           <w:ilvl w:val="0"/>
-          <w:numId w:val="5"/>
+          <w:numId w:val="4"/>
         </w:numPr>
         <w:spacing w:after="60"/>
       </w:pPr>
@@ -2374,7 +2374,7 @@
         <w:pStyle w:val="ListParagraph"/>
         <w:numPr>
           <w:ilvl w:val="0"/>
-          <w:numId w:val="6"/>
+          <w:numId w:val="5"/>
         </w:numPr>
         <w:spacing w:after="60"/>
       </w:pPr>
@@ -2387,7 +2387,7 @@
         <w:pStyle w:val="ListParagraph"/>
         <w:numPr>
           <w:ilvl w:val="0"/>
-          <w:numId w:val="6"/>
+          <w:numId w:val="5"/>
         </w:numPr>
         <w:spacing w:after="60"/>
       </w:pPr>
@@ -2410,7 +2410,7 @@
         <w:pStyle w:val="ListParagraph"/>
         <w:numPr>
           <w:ilvl w:val="0"/>
-          <w:numId w:val="6"/>
+          <w:numId w:val="5"/>
         </w:numPr>
         <w:spacing w:after="60"/>
       </w:pPr>
@@ -2423,7 +2423,7 @@
         <w:pStyle w:val="ListParagraph"/>
         <w:numPr>
           <w:ilvl w:val="0"/>
-          <w:numId w:val="6"/>
+          <w:numId w:val="5"/>
         </w:numPr>
         <w:spacing w:after="60"/>
       </w:pPr>
@@ -4968,18 +4968,6 @@
       </w:pPr>
     </w:lvl>
   </w:abstractNum>
-  <w:abstractNum w:abstractNumId="6" w15:restartNumberingAfterBreak="0">
-    <w:multiLevelType w:val="hybridMultilevel"/>
-    <w:lvl w:ilvl="0" w:tentative="1">
-      <w:start w:val="1"/>
-      <w:numFmt w:val="decimal"/>
-      <w:lvlText w:val="%1."/>
-      <w:lvlJc w:val="left"/>
-      <w:pPr>
-        <w:ind w:left="540" w:hanging="360"/>
-      </w:pPr>
-    </w:lvl>
-  </w:abstractNum>
   <w:num w:numId="1">
     <w:abstractNumId w:val="1"/>
     <w:lvlOverride w:ilvl="0">
@@ -5006,12 +4994,6 @@
   </w:num>
   <w:num w:numId="5">
     <w:abstractNumId w:val="5"/>
-    <w:lvlOverride w:ilvl="0">
-      <w:startOverride w:val="1"/>
-    </w:lvlOverride>
-  </w:num>
-  <w:num w:numId="6">
-    <w:abstractNumId w:val="6"/>
     <w:lvlOverride w:ilvl="0">
       <w:startOverride w:val="1"/>
     </w:lvlOverride>

</xml_diff>

<commit_message>
Configurable HOST and PUBLIC_URL; frontend reads API base from /config.js
server.js listens on HOST (default 0.0.0.0) and serves /config.js with
PUBLIC_URL as the API base; app.js and stock.js build every API URL from
it, falling back to relative /api. Docs and Word guides updated.

Co-Authored-By: Claude Opus 5.5 <noreply@anthropic.com>
</commit_message>
<xml_diff>
--- a/docs/Stock_System_Guide_en.docx
+++ b/docs/Stock_System_Guide_en.docx
@@ -1328,6 +1328,34 @@
           <w:sz w:val="18"/>
           <w:szCs w:val="18"/>
         </w:rPr>
+        <w:t xml:space="preserve">HOST=0.0.0.0</w:t>
+      </w:r>
+    </w:p>
+    <w:p>
+      <w:pPr>
+        <w:shd w:fill="F2F2F2" w:color="auto" w:val="clear"/>
+        <w:spacing w:after="0" w:before="0"/>
+      </w:pPr>
+      <w:r>
+        <w:rPr>
+          <w:rFonts w:ascii="Consolas" w:cs="Consolas" w:eastAsia="Consolas" w:hAnsi="Consolas"/>
+          <w:sz w:val="18"/>
+          <w:szCs w:val="18"/>
+        </w:rPr>
+        <w:t xml:space="preserve">PUBLIC_URL=http://&lt;IP&gt;:3000</w:t>
+      </w:r>
+    </w:p>
+    <w:p>
+      <w:pPr>
+        <w:shd w:fill="F2F2F2" w:color="auto" w:val="clear"/>
+        <w:spacing w:after="0" w:before="0"/>
+      </w:pPr>
+      <w:r>
+        <w:rPr>
+          <w:rFonts w:ascii="Consolas" w:cs="Consolas" w:eastAsia="Consolas" w:hAnsi="Consolas"/>
+          <w:sz w:val="18"/>
+          <w:szCs w:val="18"/>
+        </w:rPr>
         <w:t xml:space="preserve">SEC_EDGAR_CONTACT=&lt;contact email&gt;</w:t>
       </w:r>
     </w:p>
@@ -1539,6 +1567,92 @@
             </w:pPr>
             <w:r>
               <w:t xml:space="preserve">Web server port, 3000 by default</w:t>
+            </w:r>
+          </w:p>
+        </w:tc>
+      </w:tr>
+      <w:tr>
+        <w:trPr>
+          <w:tblHeader w:val="off"/>
+        </w:trPr>
+        <w:tc>
+          <w:tcPr>
+            <w:tcW w:type="dxa" w:w="2579"/>
+            <w:tcMar>
+              <w:top w:type="dxa" w:w="60"/>
+              <w:left w:type="dxa" w:w="100"/>
+              <w:bottom w:type="dxa" w:w="60"/>
+              <w:right w:type="dxa" w:w="100"/>
+            </w:tcMar>
+          </w:tcPr>
+          <w:p>
+            <w:pPr>
+              <w:spacing w:after="0"/>
+            </w:pPr>
+            <w:r>
+              <w:t xml:space="preserve">HOST</w:t>
+            </w:r>
+          </w:p>
+        </w:tc>
+        <w:tc>
+          <w:tcPr>
+            <w:tcW w:type="dxa" w:w="6447"/>
+            <w:tcMar>
+              <w:top w:type="dxa" w:w="60"/>
+              <w:left w:type="dxa" w:w="100"/>
+              <w:bottom w:type="dxa" w:w="60"/>
+              <w:right w:type="dxa" w:w="100"/>
+            </w:tcMar>
+          </w:tcPr>
+          <w:p>
+            <w:pPr>
+              <w:spacing w:after="0"/>
+            </w:pPr>
+            <w:r>
+              <w:t xml:space="preserve">Address to listen on, 0.0.0.0 (all interfaces) by default. Use 127.0.0.1 to allow this machine only.</w:t>
+            </w:r>
+          </w:p>
+        </w:tc>
+      </w:tr>
+      <w:tr>
+        <w:trPr>
+          <w:tblHeader w:val="off"/>
+        </w:trPr>
+        <w:tc>
+          <w:tcPr>
+            <w:tcW w:type="dxa" w:w="2579"/>
+            <w:tcMar>
+              <w:top w:type="dxa" w:w="60"/>
+              <w:left w:type="dxa" w:w="100"/>
+              <w:bottom w:type="dxa" w:w="60"/>
+              <w:right w:type="dxa" w:w="100"/>
+            </w:tcMar>
+          </w:tcPr>
+          <w:p>
+            <w:pPr>
+              <w:spacing w:after="0"/>
+            </w:pPr>
+            <w:r>
+              <w:t xml:space="preserve">PUBLIC_URL</w:t>
+            </w:r>
+          </w:p>
+        </w:tc>
+        <w:tc>
+          <w:tcPr>
+            <w:tcW w:type="dxa" w:w="6447"/>
+            <w:tcMar>
+              <w:top w:type="dxa" w:w="60"/>
+              <w:left w:type="dxa" w:w="100"/>
+              <w:bottom w:type="dxa" w:w="60"/>
+              <w:right w:type="dxa" w:w="100"/>
+            </w:tcMar>
+          </w:tcPr>
+          <w:p>
+            <w:pPr>
+              <w:spacing w:after="0"/>
+            </w:pPr>
+            <w:r>
+              <w:t xml:space="preserve">The site address browsers use (for example http://172.18.10.196:3000). The frontend JavaScript reads it from /config.js and sends its API calls there. When unset, relative URLs are used and any address works. Update it and restart the server if the WSL IP changes.</w:t>
             </w:r>
           </w:p>
         </w:tc>

</xml_diff>

<commit_message>
Stock monitor: filter the report by reason, translate its notes
The report view groups rows into categories - changed automatically
(delisted, listed again, name, market, Category, currency), needs
attention (symbol used by another company, duplicate symbol, name
differs, other notes) and write errors - shown as chips with counts
that filter the table. Notes from planRow() are matched by
NOTE_PATTERNS in app.js and shown translated (zh/en), in amber; errors
in red. CLAUDE docs and the system guides describe it.

Co-Authored-By: Claude Opus 5.5 <noreply@anthropic.com>
</commit_message>
<xml_diff>
--- a/docs/Stock_System_Guide_en.docx
+++ b/docs/Stock_System_Guide_en.docx
@@ -3685,6 +3685,94 @@
           <w:rFonts w:ascii="Calibri" w:cs="Calibri" w:eastAsia="Microsoft JhengHei" w:hAnsi="Calibri"/>
         </w:rPr>
         <w:t xml:space="preserve">When it finishes, it shows a summary (listed / delisted / unknown counts, changes per field, rows filled) and the per-stock changes, 15 per page.</w:t>
+      </w:r>
+    </w:p>
+    <w:p>
+      <w:pPr>
+        <w:pStyle w:val="ListParagraph"/>
+        <w:numPr>
+          <w:ilvl w:val="0"/>
+          <w:numId w:val="2"/>
+        </w:numPr>
+        <w:spacing w:after="60"/>
+      </w:pPr>
+      <w:r>
+        <w:rPr>
+          <w:rFonts w:ascii="Calibri" w:cs="Calibri" w:eastAsia="Microsoft JhengHei" w:hAnsi="Calibri"/>
+        </w:rPr>
+        <w:t xml:space="preserve">The results can be filtered by reason. Each category chip shows its count, and one stock can be in several categories:</w:t>
+      </w:r>
+    </w:p>
+    <w:p>
+      <w:pPr>
+        <w:pStyle w:val="ListParagraph"/>
+        <w:numPr>
+          <w:ilvl w:val="1"/>
+          <w:numId w:val="2"/>
+        </w:numPr>
+        <w:spacing w:after="60"/>
+      </w:pPr>
+      <w:r>
+        <w:rPr>
+          <w:rFonts w:ascii="Calibri" w:cs="Calibri" w:eastAsia="Microsoft JhengHei" w:hAnsi="Calibri"/>
+          <w:b/>
+          <w:bCs/>
+        </w:rPr>
+        <w:t xml:space="preserve">Changed automatically</w:t>
+      </w:r>
+      <w:r>
+        <w:rPr>
+          <w:rFonts w:ascii="Calibri" w:cs="Calibri" w:eastAsia="Microsoft JhengHei" w:hAnsi="Calibri"/>
+        </w:rPr>
+        <w:t xml:space="preserve">: marked delisted, listed again, name corrected, market changed, Category changed, currency filled.</w:t>
+      </w:r>
+    </w:p>
+    <w:p>
+      <w:pPr>
+        <w:pStyle w:val="ListParagraph"/>
+        <w:numPr>
+          <w:ilvl w:val="1"/>
+          <w:numId w:val="2"/>
+        </w:numPr>
+        <w:spacing w:after="60"/>
+      </w:pPr>
+      <w:r>
+        <w:rPr>
+          <w:rFonts w:ascii="Calibri" w:cs="Calibri" w:eastAsia="Microsoft JhengHei" w:hAnsi="Calibri"/>
+          <w:b/>
+          <w:bCs/>
+        </w:rPr>
+        <w:t xml:space="preserve">Needs attention (not changed)</w:t>
+      </w:r>
+      <w:r>
+        <w:rPr>
+          <w:rFonts w:ascii="Calibri" w:cs="Calibri" w:eastAsia="Microsoft JhengHei" w:hAnsi="Calibri"/>
+        </w:rPr>
+        <w:t xml:space="preserve">: symbol used by another company (left delisted), duplicate symbol (another non-delisted row has it), name differs (please check), other notes. These notes are shown in amber.</w:t>
+      </w:r>
+    </w:p>
+    <w:p>
+      <w:pPr>
+        <w:pStyle w:val="ListParagraph"/>
+        <w:numPr>
+          <w:ilvl w:val="1"/>
+          <w:numId w:val="2"/>
+        </w:numPr>
+        <w:spacing w:after="60"/>
+      </w:pPr>
+      <w:r>
+        <w:rPr>
+          <w:rFonts w:ascii="Calibri" w:cs="Calibri" w:eastAsia="Microsoft JhengHei" w:hAnsi="Calibri"/>
+          <w:b/>
+          <w:bCs/>
+        </w:rPr>
+        <w:t xml:space="preserve">Errors</w:t>
+      </w:r>
+      <w:r>
+        <w:rPr>
+          <w:rFonts w:ascii="Calibri" w:cs="Calibri" w:eastAsia="Microsoft JhengHei" w:hAnsi="Calibri"/>
+        </w:rPr>
+        <w:t xml:space="preserve">: write failed, shown in red.</w:t>
       </w:r>
     </w:p>
     <w:p>

</xml_diff>

<commit_message>
Docs: system guides describe the add-only Add Stock tab
Co-Authored-By: Claude Opus 5.5 <noreply@anthropic.com>
</commit_message>
<xml_diff>
--- a/docs/Stock_System_Guide_en.docx
+++ b/docs/Stock_System_Guide_en.docx
@@ -3255,7 +3255,7 @@
         <w:rPr>
           <w:rFonts w:ascii="Calibri" w:cs="Calibri" w:eastAsia="Microsoft JhengHei" w:hAnsi="Calibri"/>
         </w:rPr>
-        <w:t xml:space="preserve">The page has four tabs: Stock List, Add / Edit, Update Data and Stock Monitor. The current tab is kept in the address (for example </w:t>
+        <w:t xml:space="preserve">The page has four tabs: Stock List, Add Stock, Update Data and Stock Monitor. The current tab is kept in the address (for example </w:t>
       </w:r>
       <w:r>
         <w:rPr>
@@ -3344,7 +3344,7 @@
         <w:rPr>
           <w:rFonts w:ascii="Calibri" w:cs="Calibri" w:eastAsia="Microsoft JhengHei" w:hAnsi="Calibri"/>
         </w:rPr>
-        <w:t xml:space="preserve">Columns: symbol, company name, trading market, status (a green "Listed" or red "Delisted" badge), last updated, and an Edit button.</w:t>
+        <w:t xml:space="preserve">Columns: symbol, company name, trading market, status (a green "Listed" or red "Delisted" badge), and last updated.</w:t>
       </w:r>
     </w:p>
     <w:p>
@@ -3392,7 +3392,7 @@
         <w:rPr>
           <w:rFonts w:ascii="Calibri" w:cs="Calibri" w:eastAsia="Microsoft JhengHei" w:hAnsi="Calibri"/>
         </w:rPr>
-        <w:t xml:space="preserve">Edit switches to the Add / Edit tab with that row loaded.</w:t>
+        <w:t xml:space="preserve">To change an existing stock, use the Update Data tab (see 3.3).</w:t>
       </w:r>
     </w:p>
     <w:p>
@@ -3403,7 +3403,7 @@
         <w:rPr>
           <w:rFonts w:ascii="Calibri" w:cs="Calibri" w:eastAsia="Microsoft JhengHei" w:hAnsi="Calibri"/>
         </w:rPr>
-        <w:t xml:space="preserve">3.2 Adding and editing stocks</w:t>
+        <w:t xml:space="preserve">3.2 Adding stocks</w:t>
       </w:r>
     </w:p>
     <w:p>
@@ -3483,7 +3483,7 @@
         <w:rPr>
           <w:rFonts w:ascii="Calibri" w:cs="Calibri" w:eastAsia="Microsoft JhengHei" w:hAnsi="Calibri"/>
         </w:rPr>
-        <w:t xml:space="preserve">In edit mode (from the list), the tab reads "Edit Stock: SYMBOL" and you can change the symbol, name or market; Cancel goes back to adding.</w:t>
+        <w:t xml:space="preserve">This tab only adds stocks; it has no edit mode. To change a name, symbol or market, use the Update Data tab.</w:t>
       </w:r>
     </w:p>
     <w:p>

</xml_diff>

<commit_message>
npm run dev starts the API server and the React dev server together
concurrently runs "npm run server" (node --watch server.js, port 3000) and
"npm run client" (CRA dev server, port 3001) from one command, replacing
dev + dev:client. README, CLAUDE.md/CLAUDE.zh.md and the system guides
describe the new commands; the guides also get the current monitor limits
(1000 / 300).

Co-Authored-By: Claude Opus 5.5 <noreply@anthropic.com>
</commit_message>
<xml_diff>
--- a/docs/Stock_System_Guide_en.docx
+++ b/docs/Stock_System_Guide_en.docx
@@ -2669,7 +2669,7 @@
                 <w:sz w:val="20"/>
                 <w:szCs w:val="20"/>
               </w:rPr>
-              <w:t xml:space="preserve">Optional: maximum rows per check to fill company details / CUSIPs for. Defaults are 300 / 50.</w:t>
+              <w:t xml:space="preserve">Optional: maximum rows per check to fill company details / CUSIPs for. Defaults are 1000 / 300.</w:t>
             </w:r>
           </w:p>
         </w:tc>
@@ -2958,7 +2958,7 @@
           <w:sz w:val="18"/>
           <w:szCs w:val="18"/>
         </w:rPr>
-        <w:t xml:space="preserve">npm run dev         # development: the API server, restarts when code changes</w:t>
+        <w:t xml:space="preserve">npm run dev         # development: API server + React dev server (port 3001) together</w:t>
       </w:r>
     </w:p>
     <w:p>
@@ -2979,7 +2979,28 @@
           <w:sz w:val="18"/>
           <w:szCs w:val="18"/>
         </w:rPr>
-        <w:t xml:space="preserve">npm run dev:client  # use alongside: the React dev server (port 3001, updates on save)</w:t>
+        <w:t xml:space="preserve">npm run server      # only the API server, restarts when code changes</w:t>
+      </w:r>
+    </w:p>
+    <w:p>
+      <w:pPr>
+        <w:keepNext/>
+        <w:keepLines/>
+        <w:pBdr>
+          <w:left w:val="single" w:color="D9D9D9" w:sz="4" w:space="6"/>
+          <w:right w:val="single" w:color="D9D9D9" w:sz="4" w:space="6"/>
+        </w:pBdr>
+        <w:shd w:fill="F2F2F2" w:color="auto" w:val="clear"/>
+        <w:spacing w:after="0" w:before="0" w:line="228"/>
+        <w:ind w:left="200" w:right="200"/>
+      </w:pPr>
+      <w:r>
+        <w:rPr>
+          <w:rFonts w:ascii="Consolas" w:cs="Consolas" w:eastAsia="Microsoft JhengHei" w:hAnsi="Consolas"/>
+          <w:sz w:val="18"/>
+          <w:szCs w:val="18"/>
+        </w:rPr>
+        <w:t xml:space="preserve">npm run client      # only the React dev server (port 3001, updates on save)</w:t>
       </w:r>
     </w:p>
     <w:p>
@@ -3169,7 +3190,7 @@
           <w:sz w:val="19"/>
           <w:szCs w:val="19"/>
         </w:rPr>
-        <w:t xml:space="preserve">npm run dev:client</w:t>
+        <w:t xml:space="preserve">npm run dev</w:t>
       </w:r>
       <w:r>
         <w:rPr>
@@ -7071,7 +7092,7 @@
                 <w:sz w:val="19"/>
                 <w:szCs w:val="19"/>
               </w:rPr>
-              <w:t xml:space="preserve">npm run dev:client</w:t>
+              <w:t xml:space="preserve">npm run dev</w:t>
             </w:r>
             <w:r>
               <w:rPr>

</xml_diff>

<commit_message>
Stock monitor: separate pages for preview and update results
The monitor tab now has two pages, Preview results (#monitor/preview, same
format as before) and Update results (#monitor/apply). The server keeps the
last preview and the last applying run separately (GET /api/monitor/report
?mode=preview|apply). An applying run's report now also records, per stock,
the company details filled (only columns that were empty), the CUSIP filled,
a CUSIP held by another stock, and failed lookups; the update page lists
only what was written or tried.

The language switch always reads Chinese / English. The system guides
describe the two pages and the shortName name rule, and show the current
per-run limits (1000 / 300), as does .env.example.

Co-Authored-By: Claude Opus 5.5 <noreply@anthropic.com>
</commit_message>
<xml_diff>
--- a/docs/Stock_System_Guide_en.docx
+++ b/docs/Stock_System_Guide_en.docx
@@ -3786,7 +3786,55 @@
         <w:rPr>
           <w:rFonts w:ascii="Calibri" w:cs="Calibri" w:eastAsia="Microsoft JhengHei" w:hAnsi="Calibri"/>
         </w:rPr>
-        <w:t xml:space="preserve">When it finishes, it shows a summary (listed / delisted / unknown counts, changes per field, rows filled) and the per-stock changes, 15 per page.</w:t>
+        <w:t xml:space="preserve">Results are on two pages inside the tab, Preview results and Update results; each button switches to its page (the address ends in #monitor/preview or #monitor/apply). Each page shows its last run's summary (listed / delisted / unknown counts, changes per field, rows filled) and the per-stock rows, 15 per page.</w:t>
+      </w:r>
+    </w:p>
+    <w:p>
+      <w:pPr>
+        <w:pStyle w:val="ListParagraph"/>
+        <w:numPr>
+          <w:ilvl w:val="1"/>
+          <w:numId w:val="2"/>
+        </w:numPr>
+        <w:spacing w:after="60"/>
+      </w:pPr>
+      <w:r>
+        <w:rPr>
+          <w:rFonts w:ascii="Calibri" w:cs="Calibri" w:eastAsia="Microsoft JhengHei" w:hAnsi="Calibri"/>
+          <w:b/>
+          <w:bCs/>
+        </w:rPr>
+        <w:t xml:space="preserve">Preview results</w:t>
+      </w:r>
+      <w:r>
+        <w:rPr>
+          <w:rFonts w:ascii="Calibri" w:cs="Calibri" w:eastAsia="Microsoft JhengHei" w:hAnsi="Calibri"/>
+        </w:rPr>
+        <w:t xml:space="preserve">: everything the last preview found, in the same format as before - the fields that would change and the stocks that need attention.</w:t>
+      </w:r>
+    </w:p>
+    <w:p>
+      <w:pPr>
+        <w:pStyle w:val="ListParagraph"/>
+        <w:numPr>
+          <w:ilvl w:val="1"/>
+          <w:numId w:val="2"/>
+        </w:numPr>
+        <w:spacing w:after="60"/>
+      </w:pPr>
+      <w:r>
+        <w:rPr>
+          <w:rFonts w:ascii="Calibri" w:cs="Calibri" w:eastAsia="Microsoft JhengHei" w:hAnsi="Calibri"/>
+          <w:b/>
+          <w:bCs/>
+        </w:rPr>
+        <w:t xml:space="preserve">Update results</w:t>
+      </w:r>
+      <w:r>
+        <w:rPr>
+          <w:rFonts w:ascii="Calibri" w:cs="Calibri" w:eastAsia="Microsoft JhengHei" w:hAnsi="Calibri"/>
+        </w:rPr>
+        <w:t xml:space="preserve">: only what the last Check &amp; Update wrote or tried to write - changed fields, company info filled in (with the fields) and CUSIPs filled in, and anything not written (a CUSIP already held by another stock, a failed lookup or write). Stocks that only need attention are on the preview page.</w:t>
       </w:r>
     </w:p>
     <w:p>
@@ -3826,7 +3874,7 @@
         <w:rPr>
           <w:rFonts w:ascii="Calibri" w:cs="Calibri" w:eastAsia="Microsoft JhengHei" w:hAnsi="Calibri"/>
         </w:rPr>
-        <w:t xml:space="preserve">: marked delisted, listed again, name corrected, market changed, Category changed, currency filled.</w:t>
+        <w:t xml:space="preserve">: marked delisted, listed again, name corrected, market changed, Category changed, currency filled (called Updated automatically on the update page).</w:t>
       </w:r>
     </w:p>
     <w:p>
@@ -3844,13 +3892,13 @@
           <w:b/>
           <w:bCs/>
         </w:rPr>
-        <w:t xml:space="preserve">Needs attention (not changed)</w:t>
-      </w:r>
-      <w:r>
-        <w:rPr>
-          <w:rFonts w:ascii="Calibri" w:cs="Calibri" w:eastAsia="Microsoft JhengHei" w:hAnsi="Calibri"/>
-        </w:rPr>
-        <w:t xml:space="preserve">: symbol used by another company (left delisted), duplicate symbol (another non-delisted row has it), name differs (please check), other notes. These notes are shown in amber.</w:t>
+        <w:t xml:space="preserve">Filled in</w:t>
+      </w:r>
+      <w:r>
+        <w:rPr>
+          <w:rFonts w:ascii="Calibri" w:cs="Calibri" w:eastAsia="Microsoft JhengHei" w:hAnsi="Calibri"/>
+        </w:rPr>
+        <w:t xml:space="preserve"> (update page): company info filled, CUSIP filled, shown in green.</w:t>
       </w:r>
     </w:p>
     <w:p>
@@ -3868,13 +3916,37 @@
           <w:b/>
           <w:bCs/>
         </w:rPr>
+        <w:t xml:space="preserve">Needs attention (not changed)</w:t>
+      </w:r>
+      <w:r>
+        <w:rPr>
+          <w:rFonts w:ascii="Calibri" w:cs="Calibri" w:eastAsia="Microsoft JhengHei" w:hAnsi="Calibri"/>
+        </w:rPr>
+        <w:t xml:space="preserve">: symbol used by another company (left delisted), duplicate symbol (another non-delisted row has it), name differs (please check), other notes. These notes are shown in amber.</w:t>
+      </w:r>
+    </w:p>
+    <w:p>
+      <w:pPr>
+        <w:pStyle w:val="ListParagraph"/>
+        <w:numPr>
+          <w:ilvl w:val="1"/>
+          <w:numId w:val="2"/>
+        </w:numPr>
+        <w:spacing w:after="60"/>
+      </w:pPr>
+      <w:r>
+        <w:rPr>
+          <w:rFonts w:ascii="Calibri" w:cs="Calibri" w:eastAsia="Microsoft JhengHei" w:hAnsi="Calibri"/>
+          <w:b/>
+          <w:bCs/>
+        </w:rPr>
         <w:t xml:space="preserve">Errors</w:t>
       </w:r>
       <w:r>
         <w:rPr>
           <w:rFonts w:ascii="Calibri" w:cs="Calibri" w:eastAsia="Microsoft JhengHei" w:hAnsi="Calibri"/>
         </w:rPr>
-        <w:t xml:space="preserve">: write failed, shown in red.</w:t>
+        <w:t xml:space="preserve">: write failed, shown in red. On the update page this group is Not written / errors and also holds CUSIP held by another stock (amber) and failed company info / CUSIP lookups.</w:t>
       </w:r>
     </w:p>
     <w:p>
@@ -3928,7 +4000,7 @@
         <w:rPr>
           <w:rFonts w:ascii="Calibri" w:cs="Calibri" w:eastAsia="Microsoft JhengHei" w:hAnsi="Calibri"/>
         </w:rPr>
-        <w:t xml:space="preserve">Switch between 中文 and English at the top right of the page; the choice is remembered in the browser. The pages follow the system's light or dark mode, and work on phones (tables scroll sideways).</w:t>
+        <w:t xml:space="preserve">Switch between Chinese and English at the top right of the page; the choice is remembered in the browser. The pages follow the system's light or dark mode, and work on phones (tables scroll sideways).</w:t>
       </w:r>
     </w:p>
     <w:p>
@@ -4420,7 +4492,7 @@
                 <w:sz w:val="20"/>
                 <w:szCs w:val="20"/>
               </w:rPr>
-              <w:t xml:space="preserve">Listed stocks need NASDAQ Trader and Yahoo to agree. Others use Yahoo's full name. Spelling differences are ignored when comparing (ETF / Fund / Shares, ETN / Exchange-Traded Notes, U.S. / US, &amp; / and, case, ...); the clean name shown on Yahoo is written, with the official spelling where only the case differs. A stored name that was cut off, carries a fund-family prefix or is abbreviated is completed. Names only 1-2 characters apart (a source's typo) are not changed, and Yahoo's fund abbreviations never replace a full name. When the sources can't confirm a name, it is only noted ("name differs"). Placeholder names such as "324823" are always corrected.</w:t>
+              <w:t xml:space="preserve">Listed stocks need NASDAQ Trader and Yahoo to agree. Others use Yahoo's full name. Spelling differences are ignored when comparing (ETF / Fund / Shares, ETN / Exchange-Traded Notes, U.S. / US, &amp; / and, case, ...); the clean name shown on Yahoo is written, with the official spelling where only the case differs. A stored name that was cut off, carries a fund-family prefix or is abbreviated is completed. For a symbol only Yahoo knows, the name is kept when Yahoo's short name (the one on its page) is the stored company, even if Yahoo's full name differs (JFBC). Names only 1-2 characters apart (a source's typo) are not changed, and Yahoo's fund abbreviations never replace a full name. When the sources can't confirm a name, it is only noted ("name differs"). Placeholder names such as "324823" are always corrected.</w:t>
             </w:r>
           </w:p>
         </w:tc>
@@ -4668,7 +4740,7 @@
                 <w:sz w:val="20"/>
                 <w:szCs w:val="20"/>
               </w:rPr>
-              <w:t xml:space="preserve">Up to 300 trading stocks with missing data per run (sector, industry, address, website, CEO, description)</w:t>
+              <w:t xml:space="preserve">Up to 1000 trading stocks with missing data per run (sector, industry, address, website, CEO, description)</w:t>
             </w:r>
           </w:p>
         </w:tc>
@@ -4730,7 +4802,7 @@
                 <w:sz w:val="20"/>
                 <w:szCs w:val="20"/>
               </w:rPr>
-              <w:t xml:space="preserve">Up to 50 trading US stocks without a CUSIP per run</w:t>
+              <w:t xml:space="preserve">Up to 300 trading US stocks without a CUSIP per run</w:t>
             </w:r>
           </w:p>
         </w:tc>

</xml_diff>

<commit_message>
Stock monitor: drop share descriptors from names; don't delist on a missed quote
- A stored name ending in a common-share descriptor ("ASP Isotopes Inc.
  Common Stock", "... Class A Ordinary Shares", "... American Depositary
  Shares", ADS/ADR) gets the sources' clean name when the NASDAQ Trader
  listing and Yahoo agree on it (242 rows on 2026-10-08). Unit / Warrant /
  Right / Notes and "- June"-style suffixes are part of a name and stay.
- PARJX, a live mutual fund, was marked delisted because a Yahoo batch
  answer left it out and the official listing never has mutual funds.
  Mutual funds are no longer judged by the listing rule, and before a live
  exchange-listed row is called delisted for having no quote its symbol is
  asked again in small batches. PARJX was set back to listed.

Docs: the system guides' monitor rules describe both.

Co-Authored-By: Claude Opus 5.5 <noreply@anthropic.com>
</commit_message>
<xml_diff>
--- a/docs/Stock_System_Guide_en.docx
+++ b/docs/Stock_System_Guide_en.docx
@@ -4306,7 +4306,7 @@
                 <w:sz w:val="20"/>
                 <w:szCs w:val="20"/>
               </w:rPr>
-              <w:t xml:space="preserve">No Yahoo trade for more than 120 days; or a plain NASDAQ/NYSE/AMEX symbol that is neither on the official listing nor on Yahoo</w:t>
+              <w:t xml:space="preserve">No Yahoo trade for more than 120 days; or a plain NASDAQ/NYSE/AMEX symbol that is neither on the official listing nor on Yahoo (asked again before deciding; never for mutual funds, which the listing does not include)</w:t>
             </w:r>
           </w:p>
         </w:tc>
@@ -4492,7 +4492,7 @@
                 <w:sz w:val="20"/>
                 <w:szCs w:val="20"/>
               </w:rPr>
-              <w:t xml:space="preserve">Listed stocks need NASDAQ Trader and Yahoo to agree. Others use Yahoo's full name. Spelling differences are ignored when comparing (ETF / Fund / Shares, ETN / Exchange-Traded Notes, U.S. / US, &amp; / and, case, ...); the clean name shown on Yahoo is written, with the official spelling where only the case differs. A stored name that was cut off, carries a fund-family prefix or is abbreviated is completed. For a symbol only Yahoo knows, the name is kept when Yahoo's short name (the one on its page) is the stored company, even if Yahoo's full name differs (JFBC). Names only 1-2 characters apart (a source's typo) are not changed, and Yahoo's fund abbreviations never replace a full name. When the sources can't confirm a name, it is only noted ("name differs"). Placeholder names such as "324823" are always corrected.</w:t>
+              <w:t xml:space="preserve">Listed stocks need NASDAQ Trader and Yahoo to agree. Others use Yahoo's full name. Spelling differences are ignored when comparing (ETF / Fund / Shares, ETN / Exchange-Traded Notes, U.S. / US, &amp; / and, case, ...); the clean name shown on Yahoo is written, with the official spelling where only the case differs. A stored name that was cut off, carries a fund-family prefix or is abbreviated is completed, and a trailing "Common Stock", "Ordinary Shares", "American Depositary Shares" (ADS/ADR) is removed when both sources confirm the name. For a symbol only Yahoo knows, the name is kept when Yahoo's short name (the one on its page) is the stored company, even if Yahoo's full name differs (JFBC). Names only 1-2 characters apart (a source's typo) are not changed, and Yahoo's fund abbreviations never replace a full name. When the sources can't confirm a name, it is only noted ("name differs"). Placeholder names such as "324823" are always corrected.</w:t>
             </w:r>
           </w:p>
         </w:tc>

</xml_diff>

<commit_message>
Stock monitor: fill up to 2000 company details and 1000 CUSIPs per run
Raised from 1000 / 300 at the user's request; the request pacing is
unchanged, so an applying run takes longer (roughly an hour or more).
.env.example, CLAUDE.md and the system guides show the new defaults.

Co-Authored-By: Claude Opus 5.5 <noreply@anthropic.com>
</commit_message>
<xml_diff>
--- a/docs/Stock_System_Guide_en.docx
+++ b/docs/Stock_System_Guide_en.docx
@@ -2669,7 +2669,7 @@
                 <w:sz w:val="20"/>
                 <w:szCs w:val="20"/>
               </w:rPr>
-              <w:t xml:space="preserve">Optional: maximum rows per check to fill company details / CUSIPs for. Defaults are 1000 / 300.</w:t>
+              <w:t xml:space="preserve">Optional: maximum rows per check to fill company details / CUSIPs for. Defaults are 2000 / 1000.</w:t>
             </w:r>
           </w:p>
         </w:tc>
@@ -4740,7 +4740,7 @@
                 <w:sz w:val="20"/>
                 <w:szCs w:val="20"/>
               </w:rPr>
-              <w:t xml:space="preserve">Up to 1000 trading stocks with missing data per run (sector, industry, address, website, CEO, description)</w:t>
+              <w:t xml:space="preserve">Up to 2000 trading stocks with missing data per run (sector, industry, address, website, CEO, description)</w:t>
             </w:r>
           </w:p>
         </w:tc>
@@ -4802,7 +4802,7 @@
                 <w:sz w:val="20"/>
                 <w:szCs w:val="20"/>
               </w:rPr>
-              <w:t xml:space="preserve">Up to 300 trading US stocks without a CUSIP per run</w:t>
+              <w:t xml:space="preserve">Up to 1000 trading US stocks without a CUSIP per run</w:t>
             </w:r>
           </w:p>
         </w:tc>

</xml_diff>

<commit_message>
Stock monitor: keep company details current, not just filled
Sector, industry, website, CEO and description are now replaced when Yahoo
has a different value (AAPL's CEO), for every trading row in rotation, and
only when Yahoo's quote is the row's company. Location and currency are
still only filled when empty. Nothing is written when nothing differs.

Co-Authored-By: Claude Opus 5.5 <noreply@anthropic.com>
</commit_message>
<xml_diff>
--- a/docs/Stock_System_Guide_en.docx
+++ b/docs/Stock_System_Guide_en.docx
@@ -3828,13 +3828,12 @@
           <w:b/>
           <w:bCs/>
         </w:rPr>
-        <w:t xml:space="preserve">Update results</w:t>
-      </w:r>
-      <w:r>
-        <w:rPr>
-          <w:rFonts w:ascii="Calibri" w:cs="Calibri" w:eastAsia="Microsoft JhengHei" w:hAnsi="Calibri"/>
-        </w:rPr>
-        <w:t xml:space="preserve">: only what the last Check &amp; Update wrote or tried to write - changed fields, company info filled in (with the fields) and CUSIPs filled in, and anything not written (a CUSIP already held by another stock, a failed lookup or write). Stocks that only need attention are on the preview page.</w:t>
+        <w:t>Update results: only what the last Check &amp; Update wrote or tried to write - changed fields (including company info updated, such as a new CEO), company info filled in (with the fields) and CUSIPs filled in, and anything not written (a CUSIP already held by another stock, a failed lookup or write). Stocks that only need attention are on the preview page.</w:t>
+      </w:r>
+      <w:r>
+        <w:rPr>
+          <w:rFonts w:ascii="Calibri" w:cs="Calibri" w:eastAsia="Microsoft JhengHei" w:hAnsi="Calibri"/>
+        </w:rPr>
       </w:r>
     </w:p>
     <w:p>
@@ -4740,7 +4739,7 @@
                 <w:sz w:val="20"/>
                 <w:szCs w:val="20"/>
               </w:rPr>
-              <w:t xml:space="preserve">Up to 2000 trading stocks with missing data per run (sector, industry, address, website, CEO, description)</w:t>
+              <w:t>Up to 2000 trading stocks per run. Sector, industry, website, CEO and description are filled when empty and replaced when Yahoo now shows something else (for example a new CEO), only when Yahoo's quote is the same company as the stored name; address and currency are only filled when empty. Stocks with missing data go first, then the rest in rotation, so successive runs cover the whole table.</w:t>
             </w:r>
           </w:p>
         </w:tc>

</xml_diff>

<commit_message>
CUSIP: read SEC's structured 13G filings; monitor refreshes stored CUSIPs
The SEC lookup now lists filings from data.sec.gov/submissions, which
includes the structured SCHEDULE 13G form used since late 2024, so it
finds current CUSIPs. The monitor re-checks stored CUSIPs in rotation and
replaces one only when the newest structured SEC filing shows another.

Co-Authored-By: Claude Opus 5.5 <noreply@anthropic.com>
</commit_message>
<xml_diff>
--- a/docs/Stock_System_Guide_en.docx
+++ b/docs/Stock_System_Guide_en.docx
@@ -4801,7 +4801,7 @@
                 <w:sz w:val="20"/>
                 <w:szCs w:val="20"/>
               </w:rPr>
-              <w:t xml:space="preserve">Up to 1000 trading US stocks without a CUSIP per run</w:t>
+              <w:t>Empty: up to 1000 trading US stocks per run. Stored: up to 1000 more are re-checked against SEC per run, in rotation, and replaced only when the newest SEC 13G filing (structured form, filed since late 2024) shows a different CUSIP - e.g. after a reverse split or a new holding company (SMCI 86800U104 -&gt; 86800U302).</w:t>
             </w:r>
           </w:p>
         </w:tc>
@@ -4898,7 +4898,7 @@
         <w:rPr>
           <w:rFonts w:ascii="Calibri" w:cs="Calibri" w:eastAsia="Microsoft JhengHei" w:hAnsi="Calibri"/>
         </w:rPr>
-        <w:t xml:space="preserve">SEC EDGAR 13G filings are checked first. Only filings actually about the company count, and the number must agree across filings (a vote).</w:t>
+        <w:t>SEC EDGAR 13G filings are checked first, in both the old text form and the structured form used since late 2024 (newest first). Only filings actually about the company count, and the number must agree across filings (a vote).</w:t>
       </w:r>
     </w:p>
     <w:p>

</xml_diff>

<commit_message>
Stock monitor: fill up to 5000 company details and 2000 CUSIPs per run
Co-Authored-By: Claude Opus 5.5 <noreply@anthropic.com>
</commit_message>
<xml_diff>
--- a/docs/Stock_System_Guide_en.docx
+++ b/docs/Stock_System_Guide_en.docx
@@ -2669,7 +2669,7 @@
                 <w:sz w:val="20"/>
                 <w:szCs w:val="20"/>
               </w:rPr>
-              <w:t xml:space="preserve">Optional: maximum rows per check to fill company details / CUSIPs for. Defaults are 2000 / 1000.</w:t>
+              <w:t>Optional: maximum rows per check to fill company details / CUSIPs for. Defaults are 5000 / 2000.</w:t>
             </w:r>
           </w:p>
         </w:tc>
@@ -4739,7 +4739,7 @@
                 <w:sz w:val="20"/>
                 <w:szCs w:val="20"/>
               </w:rPr>
-              <w:t>Up to 2000 trading stocks per run. Sector, industry, website, CEO and description are filled when empty and replaced when Yahoo now shows something else (for example a new CEO), only when Yahoo's quote is the same company as the stored name; address and currency are only filled when empty. Stocks with missing data go first, then the rest in rotation, so successive runs cover the whole table.</w:t>
+              <w:t>Up to 5000 trading stocks per run. Sector, industry, website, CEO and description are filled when empty and replaced when Yahoo now shows something else (for example a new CEO), only when Yahoo's quote is the same company as the stored name; address and currency are only filled when empty. Stocks with missing data go first, then the rest in rotation, so successive runs cover the whole table.</w:t>
             </w:r>
           </w:p>
         </w:tc>
@@ -4801,7 +4801,7 @@
                 <w:sz w:val="20"/>
                 <w:szCs w:val="20"/>
               </w:rPr>
-              <w:t>Empty: up to 1000 trading US stocks per run. Stored: up to 1000 more are re-checked against SEC per run, in rotation, and replaced only when the newest SEC 13G filing (structured form, filed since late 2024) shows a different CUSIP - e.g. after a reverse split or a new holding company (SMCI 86800U104 -&gt; 86800U302).</w:t>
+              <w:t>Empty: up to 2000 trading US stocks per run. Stored: up to 1000 more are re-checked against SEC per run, in rotation, and replaced only when the newest SEC 13G filing (structured form, filed since late 2024) shows a different CUSIP - e.g. after a reverse split or a new holding company (SMCI 86800U104 -&gt; 86800U302).</w:t>
             </w:r>
           </w:p>
         </w:tc>

</xml_diff>

<commit_message>
Stock monitor: check up to 10000 company details per run
Co-Authored-By: Claude Opus 5.5 <noreply@anthropic.com>
</commit_message>
<xml_diff>
--- a/docs/Stock_System_Guide_en.docx
+++ b/docs/Stock_System_Guide_en.docx
@@ -2669,7 +2669,7 @@
                 <w:sz w:val="20"/>
                 <w:szCs w:val="20"/>
               </w:rPr>
-              <w:t>Optional: maximum rows per check to fill company details / CUSIPs for. Defaults are 5000 / 2000.</w:t>
+              <w:t>Optional: maximum rows per check to fill company details / CUSIPs for. Defaults are 10000 / 2000.</w:t>
             </w:r>
           </w:p>
         </w:tc>
@@ -4739,7 +4739,7 @@
                 <w:sz w:val="20"/>
                 <w:szCs w:val="20"/>
               </w:rPr>
-              <w:t>Up to 5000 trading stocks per run. Sector, industry, website, CEO and description are filled when empty and replaced when Yahoo now shows something else (for example a new CEO), only when Yahoo's quote is the same company as the stored name; address and currency are only filled when empty. Stocks with missing data go first, then the rest in rotation, so successive runs cover the whole table.</w:t>
+              <w:t>Up to 10000 trading stocks per run. Sector, industry, website, CEO and description are filled when empty and replaced when Yahoo now shows something else (for example a new CEO), only when Yahoo's quote is the same company as the stored name; address and currency are only filled when empty. Stocks with missing data go first, then the rest in rotation, so successive runs cover the whole table.</w:t>
             </w:r>
           </w:p>
         </w:tc>

</xml_diff>

<commit_message>
CUSIP: add SEC 13F holdings as a source; verify the other stock on a duplicate
13F holdings tables (EDGAR full-text search by company name) give current
CUSIPs that 13G misses, incl. foreign issuers (LCFY Q56120134). When a
found CUSIP is already another stock's, that stock's own CUSIP is looked
up: if it's the same, the find is wrong and the next source is tried; if
it differs, the other stock's value is corrected first.

Co-Authored-By: Claude Opus 5.5 <noreply@anthropic.com>
</commit_message>
<xml_diff>
--- a/docs/Stock_System_Guide_en.docx
+++ b/docs/Stock_System_Guide_en.docx
@@ -4801,7 +4801,7 @@
                 <w:sz w:val="20"/>
                 <w:szCs w:val="20"/>
               </w:rPr>
-              <w:t>Empty: up to 2000 trading US stocks per run. Stored: up to 1000 more are re-checked against SEC per run, in rotation, and replaced only when the newest SEC 13G filing (structured form, filed since late 2024) shows a different CUSIP - e.g. after a reverse split or a new holding company (SMCI 86800U104 -&gt; 86800U302).</w:t>
+              <w:t>Empty: up to 2000 trading US stocks per run. Stored: up to 1000 more are re-checked against SEC per run, in rotation, and replaced only when current SEC data (a structured 13G filed since late 2024, or recent 13F holdings) shows a different CUSIP - e.g. after a reverse split or a new holding company (SMCI 86800U104 -&gt; 86800U302).</w:t>
             </w:r>
           </w:p>
         </w:tc>
@@ -4898,7 +4898,7 @@
         <w:rPr>
           <w:rFonts w:ascii="Calibri" w:cs="Calibri" w:eastAsia="Microsoft JhengHei" w:hAnsi="Calibri"/>
         </w:rPr>
-        <w:t>SEC EDGAR 13G filings are checked first, in both the old text form and the structured form used since late 2024 (newest first). Only filings actually about the company count, and the number must agree across filings (a vote).</w:t>
+        <w:t>SEC EDGAR 13G filings are checked first, in both the old text form and the structured form used since late 2024 (newest first). Only filings actually about the company count, and the number must agree across filings (a vote). Then the 13F holdings reports institutions file each quarter (last ~200 days), searched by company name - these also cover foreign companies (LCFY Q56120134) and are used when 13G has no current answer.</w:t>
       </w:r>
     </w:p>
     <w:p>
@@ -4946,7 +4946,7 @@
         <w:rPr>
           <w:rFonts w:ascii="Calibri" w:cs="Calibri" w:eastAsia="Microsoft JhengHei" w:hAnsi="Calibri"/>
         </w:rPr>
-        <w:t xml:space="preserve">Before writing, the system checks whether another non-delisted stock already has that CUSIP. If so, it is not written and is left for a person to check.</w:t>
+        <w:t>Before writing, the system checks whether another non-delisted stock already has that CUSIP. If so, that stock's own CUSIP is looked up: if it is the same number, the one found is wrong and the next source is tried; if that stock's own CUSIP is different, its wrong value is corrected and the found one is written; if it can't be confirmed, nothing is written and it is left for a person to check. A non-US listing of the same company (APC.DE for AAPL) may share the CUSIP.</w:t>
       </w:r>
     </w:p>
     <w:p>

</xml_diff>

<commit_message>
Stock monitor: keep currency current too; US-market rows only get USD
Currency was only filled when empty; it is now replaced when Yahoo's
differs for the same company. Yahoo labels some Nasdaq mutual funds CAD
(CFHAX, CFHIX), so a NASDAQ/NYSE/AMEX/OTC row only ever gets USD.

Co-Authored-By: Claude Opus 5.5 <noreply@anthropic.com>
</commit_message>
<xml_diff>
--- a/docs/Stock_System_Guide_en.docx
+++ b/docs/Stock_System_Guide_en.docx
@@ -4677,7 +4677,7 @@
                 <w:sz w:val="20"/>
                 <w:szCs w:val="20"/>
               </w:rPr>
-              <w:t xml:space="preserve">Filled only when empty</w:t>
+              <w:t>Filled when empty, and updated when Yahoo shows a different currency for the same company. Stocks on a US market (NASDAQ / NYSE / AMEX / OTC) only ever get USD.</w:t>
             </w:r>
           </w:p>
         </w:tc>
@@ -4739,7 +4739,7 @@
                 <w:sz w:val="20"/>
                 <w:szCs w:val="20"/>
               </w:rPr>
-              <w:t>Up to 10000 trading stocks per run. Sector, industry, address, website, CEO and description are filled when empty and replaced when Yahoo now shows something else (for example a new CEO, or the full postal address instead of a short form such as "CA"), only when Yahoo's quote is the same company as the stored name; currency is only filled when empty. Stocks with missing data go first, then the rest in rotation, so successive runs cover the whole table.</w:t>
+              <w:t>Up to 10000 trading stocks per run. Sector, industry, address, website, CEO, description and currency are filled when empty and replaced when Yahoo now shows something else (for example a new CEO, or the full postal address instead of a short form such as "CA"), only when Yahoo's quote is the same company as the stored name. Stocks with missing data go first, then the rest in rotation, so successive runs cover the whole table.</w:t>
             </w:r>
           </w:p>
         </w:tc>

</xml_diff>

<commit_message>
Switch database to waffle (was waffle_test)
Co-Authored-By: Claude Opus 5.5 <noreply@anthropic.com>
</commit_message>
<xml_diff>
--- a/docs/Stock_System_Guide_en.docx
+++ b/docs/Stock_System_Guide_en.docx
@@ -24,7 +24,7 @@
           <w:sz w:val="22"/>
           <w:szCs w:val="22"/>
         </w:rPr>
-        <w:t xml:space="preserve">Installation, Features and Operation Guide · Table test.company_profiles (database waffle_test) · Updated: 2026-10-07</w:t>
+        <w:t xml:space="preserve">Installation, Features and Operation Guide · Table test.company_profiles (database waffle) · Updated: 2026-10-07</w:t>
       </w:r>
     </w:p>
     <w:p>
@@ -491,7 +491,7 @@
                 <w:sz w:val="19"/>
                 <w:szCs w:val="19"/>
               </w:rPr>
-              <w:t xml:space="preserve">waffle_test</w:t>
+              <w:t xml:space="preserve">waffle</w:t>
             </w:r>
             <w:r>
               <w:rPr>
@@ -1884,7 +1884,7 @@
           <w:sz w:val="18"/>
           <w:szCs w:val="18"/>
         </w:rPr>
-        <w:t xml:space="preserve">PGDATABASE=waffle_test</w:t>
+        <w:t xml:space="preserve">PGDATABASE=waffle</w:t>
       </w:r>
     </w:p>
     <w:p>

</xml_diff>

<commit_message>
System guides: updated date 2026-10-15, SEC 13F in the data sources table
Co-Authored-By: Claude Opus 5.5 <noreply@anthropic.com>
</commit_message>
<xml_diff>
--- a/docs/Stock_System_Guide_en.docx
+++ b/docs/Stock_System_Guide_en.docx
@@ -24,7 +24,7 @@
           <w:sz w:val="22"/>
           <w:szCs w:val="22"/>
         </w:rPr>
-        <w:t xml:space="preserve">Installation, Features and Operation Guide · Table test.company_profiles (database waffle) · Updated: 2026-10-07</w:t>
+        <w:t xml:space="preserve">Installation, Features and Operation Guide · Table test.company_profiles (database waffle) · Updated: 2026-10-15</w:t>
       </w:r>
     </w:p>
     <w:p>
@@ -930,7 +930,7 @@
                 <w:sz w:val="20"/>
                 <w:szCs w:val="20"/>
               </w:rPr>
-              <w:t xml:space="preserve">CUSIPs from the cover page of Schedule 13G filings (US stocks)</w:t>
+              <w:t xml:space="preserve">CUSIPs from Schedule 13G cover pages and 13F holdings reports (US stocks)</w:t>
             </w:r>
           </w:p>
         </w:tc>

</xml_diff>

<commit_message>
Stock monitor: check the whole table, CUSIP only for rows without one
- Company details: every trading row each applying run (was capped at 10000);
  CUSIP lookup: every trading US row without one (was 2000). MONITOR_DETAIL_LIMIT /
  MONITOR_CUSIP_LIMIT and --detail-limit / --cusip-limit can still cap them.
- Removed the re-check of stored CUSIPs against SEC (MONITOR_CUSIP_REFRESH_LIMIT,
  --cusip-refresh-limit): a stored CUSIP is left as is.
- UI strings, CLAUDE.md / CLAUDE.zh.md and the system guides updated.

Co-Authored-By: Claude Opus 5.5 <noreply@anthropic.com>
</commit_message>
<xml_diff>
--- a/docs/Stock_System_Guide_en.docx
+++ b/docs/Stock_System_Guide_en.docx
@@ -2669,7 +2669,7 @@
                 <w:sz w:val="20"/>
                 <w:szCs w:val="20"/>
               </w:rPr>
-              <w:t>Optional: maximum rows per check to fill company details / CUSIPs for. Defaults are 10000 / 2000.</w:t>
+              <w:t xml:space="preserve">Optional: cap on rows per check for company details / CUSIPs. By default there is no limit - every trading stock is checked.</w:t>
             </w:r>
           </w:p>
         </w:tc>
@@ -4739,7 +4739,7 @@
                 <w:sz w:val="20"/>
                 <w:szCs w:val="20"/>
               </w:rPr>
-              <w:t>Up to 10000 trading stocks per run. Sector, industry, address, website, CEO, description and currency are filled when empty and replaced when Yahoo now shows something else (for example a new CEO, or the full postal address instead of a short form such as "CA"), only when Yahoo's quote is the same company as the stored name. Stocks with missing data go first, then the rest in rotation, so successive runs cover the whole table.</w:t>
+              <w:t xml:space="preserve">Every trading stock, every run. Sector, industry, address, website, CEO, description and currency are filled when empty and replaced when Yahoo now shows something else (for example a new CEO, or the full postal address instead of a short form such as "CA"), only when Yahoo's quote is the same company as the stored name. Stocks with missing data go first. A full run takes several hours.</w:t>
             </w:r>
           </w:p>
         </w:tc>
@@ -4801,7 +4801,7 @@
                 <w:sz w:val="20"/>
                 <w:szCs w:val="20"/>
               </w:rPr>
-              <w:t>Empty: up to 2000 trading US stocks per run. Stored: up to 1000 more are re-checked against SEC per run, in rotation, and replaced only when current SEC data (a structured 13G filed since late 2024, or recent 13F holdings) shows a different CUSIP - e.g. after a reverse split or a new holding company (SMCI 86800U104 -&gt; 86800U302).</w:t>
+              <w:t xml:space="preserve">Only stocks without one: every trading US stock that has no CUSIP, every run. A CUSIP that is already stored is not re-checked or replaced.</w:t>
             </w:r>
           </w:p>
         </w:tc>

</xml_diff>

<commit_message>
CUSIP lookup: read every 13F holdings table, majority vote, skip 00 + SEDOL
- 13F field regex was built from a template literal with a plain \w, so every
  table with namespaced tags (<ns1:cusip>, most of them) was skipped; SUSA got
  one filer's typo (46436E569 for 464288802). Fixed (\\w).
- 13F: when several issuers match, one that has >= 3 entries and >= 3x all the
  others wins (a typo is outvoted); closer than that stays ambiguous.
- Values that look like 00 + a SEDOL (some 13F filers' stand-in for a foreign
  ordinary share without a CUSIP) are uncertain and skipped (padded_sedol), except
  from a 13G about the company itself.
- CLAUDE.md / CLAUDE.zh.md (also: sandbox.audit_company_profiles is readable) and
  the system guides updated.

Co-Authored-By: Claude Opus 5.5 <noreply@anthropic.com>
</commit_message>
<xml_diff>
--- a/docs/Stock_System_Guide_en.docx
+++ b/docs/Stock_System_Guide_en.docx
@@ -4898,7 +4898,7 @@
         <w:rPr>
           <w:rFonts w:ascii="Calibri" w:cs="Calibri" w:eastAsia="Microsoft JhengHei" w:hAnsi="Calibri"/>
         </w:rPr>
-        <w:t>SEC EDGAR 13G filings are checked first, in both the old text form and the structured form used since late 2024 (newest first). Only filings actually about the company count, and the number must agree across filings (a vote). Then the 13F holdings reports institutions file each quarter (last ~200 days), searched by company name - these also cover foreign companies (LCFY Q56120134) and are used when 13G has no current answer.</w:t>
+        <w:t xml:space="preserve">SEC EDGAR 13G filings are checked first, in both the old text form and the structured form used since late 2024 (newest first). Only filings actually about the company count, and the number must agree across filings (a vote). Then the 13F holdings reports institutions file each quarter (last ~200 days), searched by company name - these also cover foreign companies (LCFY Q56120134) and are used when 13G has no current answer. Holdings reports also vote: a number is used only when it clearly outnumbers the others (at least 3 reports and 3 times all others together), so one filer's typo is outvoted; when it is close (for example a foreign share and its ADR), nothing is written.</w:t>
       </w:r>
     </w:p>
     <w:p>
@@ -4962,7 +4962,7 @@
         <w:rPr>
           <w:rFonts w:ascii="Calibri" w:cs="Calibri" w:eastAsia="Microsoft JhengHei" w:hAnsi="Calibri"/>
         </w:rPr>
-        <w:t xml:space="preserve">Every CUSIP is validated with its check digit. Non-US stocks having no CUSIP is expected.</w:t>
+        <w:t xml:space="preserve">Every CUSIP is validated with its check digit. A value that looks like "00" + a SEDOL (what some filers print for a foreign share that has no CUSIP, e.g. 006075808) is uncertain and is skipped, not written. Non-US stocks having no CUSIP is expected.</w:t>
       </w:r>
     </w:p>
     <w:p>

</xml_diff>

<commit_message>
Stock monitor: only check rows without a CUSIP, one stock at a time
- A run now checks only live US-market rows with an empty cusips (2,818 on
  waffle today, 2,640 trading); rows that have a CUSIP are not quoted, judged or
  written. Every row is still loaded for the same-symbol rules.
- Each stock is handled in one go: status / name / market (+ OTC tier,
  currency) compared and written, then on an applying run its CUSIP looked up
  and written, before the next stock. A stopped run leaves every stock it
  reached complete. A preview doesn't look up CUSIPs.
- The company-details step is removed (--detail-limit, MONITOR_DETAIL_LIMIT);
  scripts/fill-company-details.js still fills details.
- UI text, CLAUDE.md / CLAUDE.zh.md, .env.example and the system guides updated.

Co-Authored-By: Claude Opus 5.5 <noreply@anthropic.com>
</commit_message>
<xml_diff>
--- a/docs/Stock_System_Guide_en.docx
+++ b/docs/Stock_System_Guide_en.docx
@@ -2622,15 +2622,15 @@
                 <w:sz w:val="19"/>
                 <w:szCs w:val="19"/>
               </w:rPr>
-              <w:t xml:space="preserve">MONITOR_DETAIL_LIMIT</w:t>
-            </w:r>
-            <w:r>
-              <w:rPr>
-                <w:rFonts w:ascii="Calibri" w:cs="Calibri" w:eastAsia="Microsoft JhengHei" w:hAnsi="Calibri"/>
-                <w:sz w:val="20"/>
-                <w:szCs w:val="20"/>
-              </w:rPr>
-              <w:t xml:space="preserve"> / </w:t>
+              <w:t xml:space="preserve">MONITOR_CUSIP_LIMIT</w:t>
+            </w:r>
+            <w:r>
+              <w:rPr>
+                <w:rFonts w:ascii="Calibri" w:cs="Calibri" w:eastAsia="Microsoft JhengHei" w:hAnsi="Calibri"/>
+                <w:sz w:val="20"/>
+                <w:szCs w:val="20"/>
+              </w:rPr>
+              <w:t/>
             </w:r>
             <w:r>
               <w:rPr>
@@ -2639,7 +2639,7 @@
                 <w:sz w:val="19"/>
                 <w:szCs w:val="19"/>
               </w:rPr>
-              <w:t xml:space="preserve">MONITOR_CUSIP_LIMIT</w:t>
+              <w:t/>
             </w:r>
           </w:p>
         </w:tc>
@@ -2669,7 +2669,7 @@
                 <w:sz w:val="20"/>
                 <w:szCs w:val="20"/>
               </w:rPr>
-              <w:t xml:space="preserve">Optional: cap on rows per check for company details / CUSIPs. By default there is no limit - every trading stock is checked.</w:t>
+              <w:t xml:space="preserve">Optional: cap on CUSIP lookups per check. By default there is no limit - every trading stock without a CUSIP is looked up.</w:t>
             </w:r>
           </w:p>
         </w:tc>
@@ -3700,13 +3700,13 @@
           <w:b/>
           <w:bCs/>
         </w:rPr>
-        <w:t xml:space="preserve">Preview (no writes)</w:t>
-      </w:r>
-      <w:r>
-        <w:rPr>
-          <w:rFonts w:ascii="Calibri" w:cs="Calibri" w:eastAsia="Microsoft JhengHei" w:hAnsi="Calibri"/>
-        </w:rPr>
-        <w:t xml:space="preserve">: checks every stock and lists what would change, without touching the database.</w:t>
+        <w:t xml:space="preserve">Preview (no writes): checks the stocks that have no CUSIP yet (not delisted, US market) and lists what would change, without touching the database. Stocks that already have a CUSIP are not checked.</w:t>
+      </w:r>
+      <w:r>
+        <w:rPr>
+          <w:rFonts w:ascii="Calibri" w:cs="Calibri" w:eastAsia="Microsoft JhengHei" w:hAnsi="Calibri"/>
+        </w:rPr>
+        <w:t/>
       </w:r>
     </w:p>
     <w:p>
@@ -3724,13 +3724,13 @@
           <w:b/>
           <w:bCs/>
         </w:rPr>
-        <w:t xml:space="preserve">Check &amp; Update</w:t>
-      </w:r>
-      <w:r>
-        <w:rPr>
-          <w:rFonts w:ascii="Calibri" w:cs="Calibri" w:eastAsia="Microsoft JhengHei" w:hAnsi="Calibri"/>
-        </w:rPr>
-        <w:t xml:space="preserve">: checks and writes the changes (asks for confirmation first). A full run takes about 5 minutes or more.</w:t>
+        <w:t xml:space="preserve">Check &amp; Update: checks those stocks, writes the changes and looks up their CUSIPs (asks for confirmation first). Each CUSIP lookup takes a few seconds, so a run with a few thousand stocks takes a while; as CUSIPs are found, later runs have fewer stocks to check.</w:t>
+      </w:r>
+      <w:r>
+        <w:rPr>
+          <w:rFonts w:ascii="Calibri" w:cs="Calibri" w:eastAsia="Microsoft JhengHei" w:hAnsi="Calibri"/>
+        </w:rPr>
+        <w:t/>
       </w:r>
     </w:p>
     <w:p>
@@ -3770,7 +3770,7 @@
         <w:rPr>
           <w:rFonts w:ascii="Calibri" w:cs="Calibri" w:eastAsia="Microsoft JhengHei" w:hAnsi="Calibri"/>
         </w:rPr>
-        <w:t xml:space="preserve">While it runs, a progress bar and the current phase are shown (loading rows, fetching Yahoo quotes, comparing and updating, filling company info, filling CUSIPs).</w:t>
+        <w:t xml:space="preserve">While it runs, a progress bar and the current phase are shown (loading rows, fetching Yahoo quotes, then checking each stock: name, market and CUSIP together, one stock at a time - so a stopped run leaves every stock it reached complete).</w:t>
       </w:r>
     </w:p>
     <w:p>
@@ -3828,7 +3828,7 @@
           <w:b/>
           <w:bCs/>
         </w:rPr>
-        <w:t>Update results: only what the last Check &amp; Update wrote or tried to write - changed fields (including company info updated, such as a new CEO), company info filled in (with the fields) and CUSIPs filled in, and anything not written (a CUSIP already held by another stock, a failed lookup or write). Stocks that only need attention are on the preview page.</w:t>
+        <w:t xml:space="preserve">Update results: only what the last Check &amp; Update wrote or tried to write - changed fields, CUSIPs filled in, and anything not written (a CUSIP already held by another stock, a failed lookup or write). Stocks that only need attention are on the preview page.</w:t>
       </w:r>
       <w:r>
         <w:rPr>
@@ -3867,13 +3867,13 @@
           <w:b/>
           <w:bCs/>
         </w:rPr>
-        <w:t xml:space="preserve">Changed automatically</w:t>
-      </w:r>
-      <w:r>
-        <w:rPr>
-          <w:rFonts w:ascii="Calibri" w:cs="Calibri" w:eastAsia="Microsoft JhengHei" w:hAnsi="Calibri"/>
-        </w:rPr>
-        <w:t xml:space="preserve">: marked delisted, listed again, name corrected, market changed, Category changed, currency filled (called Updated automatically on the update page).</w:t>
+        <w:t xml:space="preserve">Changed automatically: marked delisted, name corrected, market changed, Category changed, currency filled (called Updated automatically on the update page).</w:t>
+      </w:r>
+      <w:r>
+        <w:rPr>
+          <w:rFonts w:ascii="Calibri" w:cs="Calibri" w:eastAsia="Microsoft JhengHei" w:hAnsi="Calibri"/>
+        </w:rPr>
+        <w:t/>
       </w:r>
     </w:p>
     <w:p>
@@ -3891,13 +3891,13 @@
           <w:b/>
           <w:bCs/>
         </w:rPr>
-        <w:t xml:space="preserve">Filled in</w:t>
-      </w:r>
-      <w:r>
-        <w:rPr>
-          <w:rFonts w:ascii="Calibri" w:cs="Calibri" w:eastAsia="Microsoft JhengHei" w:hAnsi="Calibri"/>
-        </w:rPr>
-        <w:t xml:space="preserve"> (update page): company info filled, CUSIP filled, shown in green.</w:t>
+        <w:t xml:space="preserve">Filled in (update page): CUSIP filled, shown in green.</w:t>
+      </w:r>
+      <w:r>
+        <w:rPr>
+          <w:rFonts w:ascii="Calibri" w:cs="Calibri" w:eastAsia="Microsoft JhengHei" w:hAnsi="Calibri"/>
+        </w:rPr>
+        <w:t/>
       </w:r>
     </w:p>
     <w:p>
@@ -3939,13 +3939,13 @@
           <w:b/>
           <w:bCs/>
         </w:rPr>
-        <w:t xml:space="preserve">Errors</w:t>
-      </w:r>
-      <w:r>
-        <w:rPr>
-          <w:rFonts w:ascii="Calibri" w:cs="Calibri" w:eastAsia="Microsoft JhengHei" w:hAnsi="Calibri"/>
-        </w:rPr>
-        <w:t xml:space="preserve">: write failed, shown in red. On the update page this group is Not written / errors and also holds CUSIP held by another stock (amber) and failed company info / CUSIP lookups.</w:t>
+        <w:t xml:space="preserve">Errors: write failed, shown in red. On the update page this group is Not written / errors and also holds CUSIP held by another stock (amber) and failed CUSIP lookups.</w:t>
+      </w:r>
+      <w:r>
+        <w:rPr>
+          <w:rFonts w:ascii="Calibri" w:cs="Calibri" w:eastAsia="Microsoft JhengHei" w:hAnsi="Calibri"/>
+        </w:rPr>
+        <w:t/>
       </w:r>
     </w:p>
     <w:p>
@@ -4429,7 +4429,7 @@
                 <w:sz w:val="20"/>
                 <w:szCs w:val="20"/>
               </w:rPr>
-              <w:t xml:space="preserve">Only when the current name is the same company as the stored one, and no other non-delisted row uses the symbol</w:t>
+              <w:t xml:space="preserve">Not done by the monitor any more: it only checks stocks that are not delisted.</w:t>
             </w:r>
           </w:p>
         </w:tc>
@@ -4739,7 +4739,7 @@
                 <w:sz w:val="20"/>
                 <w:szCs w:val="20"/>
               </w:rPr>
-              <w:t xml:space="preserve">Every trading stock, every run. Sector, industry, address, website, CEO, description and currency are filled when empty and replaced when Yahoo now shows something else (for example a new CEO, or the full postal address instead of a short form such as "CA"), only when Yahoo's quote is the same company as the stored name. Stocks with missing data go first. A full run takes several hours.</w:t>
+              <w:t xml:space="preserve">Not part of the monitor (since 2026-10-15). New stocks get their company details when added; scripts/fill-company-details.js fills them in for existing ones.</w:t>
             </w:r>
           </w:p>
         </w:tc>
@@ -4801,7 +4801,7 @@
                 <w:sz w:val="20"/>
                 <w:szCs w:val="20"/>
               </w:rPr>
-              <w:t xml:space="preserve">Only stocks without one: every trading US stock that has no CUSIP, every run. A CUSIP that is already stored is not re-checked or replaced.</w:t>
+              <w:t xml:space="preserve">Every checked stock that is still trading, every run. A CUSIP that is already stored is not re-checked or replaced.</w:t>
             </w:r>
           </w:p>
         </w:tc>

</xml_diff>

<commit_message>
CUSIP lookup: SPAC shares no longer get their units' CUSIP
IPO buyers' 13Gs often print the units' CUSIP under "Class A ordinary
shares" (BRTM got BRTMU's G1535G125; the sponsor's 13D has G1535G109).

- SEC 13D filings count too (structured <issuerCIK> / <dateOfEvent>).
- For a common share whose company also has units: 13Gs dated before the
  share's first trade (Yahoo) and cover pages about the units don't vote;
  the rest are counted instead of newest-wins; a tie writes nothing.
- A CUSIP already held by another security of the same company (same SEC
  CIK, unit/warrant vs common) is that holder's: dropped, and SEC re-votes
  without it.
- System guides (en / zh-TW): the SPAC rule.

Co-Authored-By: Claude Opus 5.5 <noreply@anthropic.com>
</commit_message>
<xml_diff>
--- a/docs/Stock_System_Guide_en.docx
+++ b/docs/Stock_System_Guide_en.docx
@@ -4597,6 +4597,22 @@
           <w:rFonts w:ascii="Calibri" w:cs="Calibri" w:eastAsia="Microsoft JhengHei" w:hAnsi="Calibri"/>
         </w:rPr>
         <w:t xml:space="preserve">Preferreds, warrants, units and multi-class shares skip SEC and use quantumonline.</w:t>
+      </w:r>
+    </w:p>
+    <w:p>
+      <w:pPr>
+        <w:pStyle w:val="ListParagraph"/>
+        <w:numPr>
+          <w:ilvl w:val="0"/>
+          <w:numId w:val="2"/>
+        </w:numPr>
+        <w:spacing w:after="60"/>
+      </w:pPr>
+      <w:r>
+        <w:rPr>
+          <w:rFonts w:ascii="Calibri" w:cs="Calibri" w:eastAsia="Microsoft JhengHei" w:hAnsi="Calibri"/>
+        </w:rPr>
+        <w:t xml:space="preserve">SPACs (a company that also has units trading, such as BRTM with BRTMU / BRTMW): IPO buyers often print the units' CUSIP on their 13G under "Class A ordinary shares", because until the shares trade on their own (Yahoo's first trade date) the units are all they hold. So for the shares of such a company the sponsor's 13D also counts, while a 13G about a date before the shares' first trade and filings about the units do not; the remaining numbers are counted, and a tie writes nothing. A number that another security of the same company already holds is dropped (a unit and its share never share a CUSIP), and the next answer is used.</w:t>
       </w:r>
     </w:p>
     <w:p>

</xml_diff>

<commit_message>
UI: English only - remove the Chinese interface
- translations.js keeps only the English strings; i18n.js is useT() and
  useTitle() (no LangContext / useLang / localStorage choice).
- The Chinese / English dropdown is gone from the header; index.html is
  lang="en" without the language script.
- Tests: TRANSLATIONS has only en, and no CJK character anywhere in
  client/src or public/index.html; monitor note tests in English.
- System guides 3.6 "Appearance"; CLAUDE.md updated.

Co-Authored-By: Claude Opus 5.5 <noreply@anthropic.com>
</commit_message>
<xml_diff>
--- a/docs/Stock_System_Guide_en.docx
+++ b/docs/Stock_System_Guide_en.docx
@@ -3780,7 +3780,7 @@
         <w:rPr>
           <w:rFonts w:ascii="Calibri" w:cs="Calibri" w:eastAsia="Microsoft JhengHei" w:hAnsi="Calibri"/>
         </w:rPr>
-        <w:t xml:space="preserve">3.6 Language and appearance</w:t>
+        <w:t xml:space="preserve">3.6 Appearance</w:t>
       </w:r>
     </w:p>
     <w:p>
@@ -3792,7 +3792,7 @@
         <w:rPr>
           <w:rFonts w:ascii="Calibri" w:cs="Calibri" w:eastAsia="Microsoft JhengHei" w:hAnsi="Calibri"/>
         </w:rPr>
-        <w:t xml:space="preserve">Switch between Chinese and English at the top right of the page; the choice is remembered in the browser. The pages follow the system's light or dark mode, and work on phones (tables scroll sideways).</w:t>
+        <w:t xml:space="preserve">The interface is in English only (the Chinese interface and the language switch were removed on 2026-10-19). The pages follow the system's light or dark mode, and work on phones (tables scroll sideways).</w:t>
       </w:r>
     </w:p>
     <w:p>

</xml_diff>